<commit_message>
feat(gui): highlighted stretches to check — missing beat, detections too close, no repolarisation — with next/previous navigation
Marco's request: colour the stretches where a depolarisation is missing between two beats, and
the opposite, so the operator knows where to look. ReviewState.problems() flags intervals longer
than 1.5× the median interval (battito_mancante, the rule that also excludes them from the beating
period), shorter than 0.5× (battiti_vicini) and beats without a repolarisation up to the next beat
(ripolarizzazione_assente). The viewer draws them as red / blue / violet regions over the orange
bursts; the Revisione panel shows a legend with the counts and '◀' / 'Prossimo tratto ▶' buttons;
Ctrl+G / Ctrl+Shift+G (menu Revisione) centre the view on the next / previous stretch and select
the beat before it; the status bar names it. Manual §5.8, tests.

Co-Authored-By: Claude Fable 5.1 <noreply@anthropic.com>
</commit_message>
<xml_diff>
--- a/docs/MANUALE_Cardiac_FP_Analyzer.docx
+++ b/docs/MANUALE_Cardiac_FP_Analyzer.docx
@@ -7547,6 +7547,65 @@
       </w:r>
       <w:r>
         <w:t xml:space="preserve">. I burst di rumore sono evidenziati in arancio. Tastiera: ← → battito precedente/successivo (cerchio arancione), Canc toglie il battito selezionato, P / N ripolarizzazione sul picco positivo / negativo per tutti i battiti, Ctrl+Z / Ctrl+Shift+Z annulla e ripete qualsiasi correzione, Ctrl+S salva.</w:t>
+      </w:r>
+    </w:p>
+    <w:p>
+      <w:pPr>
+        <w:pStyle w:val="BodyText"/>
+      </w:pPr>
+      <w:r>
+        <w:rPr>
+          <w:b/>
+        </w:rPr>
+        <w:t xml:space="preserve">Tratti da controllare</w:t>
+      </w:r>
+      <w:r>
+        <w:t xml:space="preserve"> </w:t>
+      </w:r>
+      <w:r>
+        <w:t xml:space="preserve">(dalla v3.18). Sul tracciato sono evidenziati in colore i tratti dove la sequenza dei marcatori non torna: in rosso un intervallo tra due depolarizzazioni più lungo di 1,5 volte la mediana (</w:t>
+      </w:r>
+      <w:r>
+        <w:rPr>
+          <w:i/>
+        </w:rPr>
+        <w:t xml:space="preserve">battito mancante?</w:t>
+      </w:r>
+      <w:r>
+        <w:t xml:space="preserve">: una depolarizzazione probabilmente non rilevata; lo stesso intervallo è escluso dal periodo), in blu un intervallo più corto della metà della mediana (</w:t>
+      </w:r>
+      <w:r>
+        <w:rPr>
+          <w:i/>
+        </w:rPr>
+        <w:t xml:space="preserve">battiti troppo vicini</w:t>
+      </w:r>
+      <w:r>
+        <w:t xml:space="preserve">: un rilevamento di troppo), in viola il tratto dopo una depolarizzazione senza ripolarizzazione fino al battito successivo (</w:t>
+      </w:r>
+      <w:r>
+        <w:rPr>
+          <w:i/>
+        </w:rPr>
+        <w:t xml:space="preserve">ripolarizzazione assente</w:t>
+      </w:r>
+      <w:r>
+        <w:t xml:space="preserve">); i burst restano in arancio. La legenda con i conteggi è nel pannello Revisione;</w:t>
+      </w:r>
+      <w:r>
+        <w:t xml:space="preserve"> </w:t>
+      </w:r>
+      <w:r>
+        <w:rPr>
+          <w:i/>
+        </w:rPr>
+        <w:t xml:space="preserve">Prossimo tratto ▶</w:t>
+      </w:r>
+      <w:r>
+        <w:t xml:space="preserve"> </w:t>
+      </w:r>
+      <w:r>
+        <w:t xml:space="preserve">(Ctrl+G) e ◀ (Ctrl+Shift+G) portano la vista sul tratto successivo o precedente e selezionano il battito che lo precede, così da correggere direttamente con il menu di Edit.</w:t>
       </w:r>
     </w:p>
     <w:p>

</xml_diff>

<commit_message>
fix(gui): missing-beat stretch in orange, bursts in grey — red stays with the depolarisation markers
Co-Authored-By: Claude Fable 5.1 <noreply@anthropic.com>
</commit_message>
<xml_diff>
--- a/docs/MANUALE_Cardiac_FP_Analyzer.docx
+++ b/docs/MANUALE_Cardiac_FP_Analyzer.docx
@@ -7546,7 +7546,7 @@
         <w:t xml:space="preserve">… qui e propaga il criterio a tutti</w:t>
       </w:r>
       <w:r>
-        <w:t xml:space="preserve">. I burst di rumore sono evidenziati in arancio. Tastiera: ← → battito precedente/successivo (cerchio arancione), Canc toglie il battito selezionato, P / N ripolarizzazione sul picco positivo / negativo per tutti i battiti, Ctrl+Z / Ctrl+Shift+Z annulla e ripete qualsiasi correzione, Ctrl+S salva.</w:t>
+        <w:t xml:space="preserve">. I burst di rumore sono evidenziati in grigio. Tastiera: ← → battito precedente/successivo (cerchio arancione), Canc toglie il battito selezionato, P / N ripolarizzazione sul picco positivo / negativo per tutti i battiti, Ctrl+Z / Ctrl+Shift+Z annulla e ripete qualsiasi correzione, Ctrl+S salva.</w:t>
       </w:r>
     </w:p>
     <w:p>
@@ -7563,7 +7563,7 @@
         <w:t xml:space="preserve"> </w:t>
       </w:r>
       <w:r>
-        <w:t xml:space="preserve">(dalla v3.18). Sul tracciato sono evidenziati in colore i tratti dove la sequenza dei marcatori non torna: in rosso un intervallo tra due depolarizzazioni più lungo di 1,5 volte la mediana (</w:t>
+        <w:t xml:space="preserve">(dalla v3.18). Sul tracciato sono evidenziati in colore i tratti dove la sequenza dei marcatori non torna: in arancio un intervallo tra due depolarizzazioni più lungo di 1,5 volte la mediana (</w:t>
       </w:r>
       <w:r>
         <w:rPr>
@@ -7590,7 +7590,7 @@
         <w:t xml:space="preserve">ripolarizzazione assente</w:t>
       </w:r>
       <w:r>
-        <w:t xml:space="preserve">); i burst restano in arancio. La legenda con i conteggi è nel pannello Revisione;</w:t>
+        <w:t xml:space="preserve">); i burst sono in grigio (il rosso è dei marcatori di depolarizzazione). La legenda con i conteggi è nel pannello Revisione;</w:t>
       </w:r>
       <w:r>
         <w:t xml:space="preserve"> </w:t>

</xml_diff>

<commit_message>
feat(gui): review queue groups the two electrodes of one tissue, with a tick for the electrode used
A single-tissue file with two inputs now gives one tissue row with EL1 / EL2 sub-rows (judgement and
measures of each, 'scelta del software' on the one auto would pick) and a checkbox in 'Usa' for the
electrode whose measures count; the choice is saved in the recording's .review.json
('elettrodo_scelto', ReviewState.save_choice / chosen_electrode), honoured by analyze_single_file in
auto mode (use_overrides on, not for two-tissue files; file_info['electrode_choice'] = 'operatore'),
by the Results export (records_from_folder records the electrode actually analysed) and therefore
by the batch. Two-tissue files and chip chambers keep one row per tissue. The tree is rebuilt after
the itemChanged handler returns (clearing it from inside the signal crashed Qt).

Co-Authored-By: Claude Fable 5.1 <noreply@anthropic.com>
</commit_message>
<xml_diff>
--- a/docs/MANUALE_Cardiac_FP_Analyzer.docx
+++ b/docs/MANUALE_Cardiac_FP_Analyzer.docx
@@ -8069,6 +8069,110 @@
       </w:r>
       <w:r>
         <w:t xml:space="preserve">, anche in una cartella sopra a quella aperta, è lei a dire chip, camera, test item e dose di ogni ingresso.</w:t>
+      </w:r>
+    </w:p>
+    <w:p>
+      <w:pPr>
+        <w:pStyle w:val="BodyText"/>
+      </w:pPr>
+      <w:r>
+        <w:rPr>
+          <w:b/>
+        </w:rPr>
+        <w:t xml:space="preserve">Due elettrodi dello stesso tessuto.</w:t>
+      </w:r>
+      <w:r>
+        <w:t xml:space="preserve"> </w:t>
+      </w:r>
+      <w:r>
+        <w:t xml:space="preserve">Quando un file contiene i due elettrodi dello stesso costrutto (un CSV a un tessuto con due ingressi) la coda li analizza entrambi e li mostra come sotto-righe EL1 / EL2 della riga del tessuto, ciascuna con giudizio e misure; la spunta nella colonna</w:t>
+      </w:r>
+      <w:r>
+        <w:t xml:space="preserve"> </w:t>
+      </w:r>
+      <w:r>
+        <w:rPr>
+          <w:i/>
+        </w:rPr>
+        <w:t xml:space="preserve">Usa</w:t>
+      </w:r>
+      <w:r>
+        <w:t xml:space="preserve"> </w:t>
+      </w:r>
+      <w:r>
+        <w:t xml:space="preserve">indica l’elettrodo usato per le misure — di default quello scelto dal software per qualità del segnale, segnato</w:t>
+      </w:r>
+      <w:r>
+        <w:t xml:space="preserve"> </w:t>
+      </w:r>
+      <w:r>
+        <w:t xml:space="preserve">“</w:t>
+      </w:r>
+      <w:r>
+        <w:t xml:space="preserve">scelta del software</w:t>
+      </w:r>
+      <w:r>
+        <w:t xml:space="preserve">”</w:t>
+      </w:r>
+      <w:r>
+        <w:t xml:space="preserve"> </w:t>
+      </w:r>
+      <w:r>
+        <w:t xml:space="preserve">— e si può spostare sull’altro. La scelta viene salvata nel</w:t>
+      </w:r>
+      <w:r>
+        <w:t xml:space="preserve"> </w:t>
+      </w:r>
+      <w:r>
+        <w:rPr>
+          <w:rStyle w:val="VerbatimChar"/>
+        </w:rPr>
+        <w:t xml:space="preserve">.review.json</w:t>
+      </w:r>
+      <w:r>
+        <w:t xml:space="preserve"> </w:t>
+      </w:r>
+      <w:r>
+        <w:t xml:space="preserve">della registrazione (</w:t>
+      </w:r>
+      <w:r>
+        <w:rPr>
+          <w:rStyle w:val="VerbatimChar"/>
+        </w:rPr>
+        <w:t xml:space="preserve">elettrodo_scelto</w:t>
+      </w:r>
+      <w:r>
+        <w:t xml:space="preserve">) e vale anche quando il file viene riaperto in modalità</w:t>
+      </w:r>
+      <w:r>
+        <w:t xml:space="preserve"> </w:t>
+      </w:r>
+      <w:r>
+        <w:rPr>
+          <w:i/>
+        </w:rPr>
+        <w:t xml:space="preserve">Auto</w:t>
+      </w:r>
+      <w:r>
+        <w:t xml:space="preserve">, nell’export Results e nel batch (con</w:t>
+      </w:r>
+      <w:r>
+        <w:t xml:space="preserve"> </w:t>
+      </w:r>
+      <w:r>
+        <w:t xml:space="preserve">“</w:t>
+      </w:r>
+      <w:r>
+        <w:t xml:space="preserve">Applica correzioni manuali</w:t>
+      </w:r>
+      <w:r>
+        <w:t xml:space="preserve">”</w:t>
+      </w:r>
+      <w:r>
+        <w:t xml:space="preserve"> </w:t>
+      </w:r>
+      <w:r>
+        <w:t xml:space="preserve">attivo). Nei file a due tessuti (un tessuto per ingresso) e nelle camere dei chip la riga è una per tessuto, senza sotto-righe.</w:t>
       </w:r>
     </w:p>
     <w:p>

</xml_diff>

<commit_message>
feat(review): approval and closure of every recording — tick in the panel, padlock in the queue, saved in the sidecar
ReviewState carries a workflow state: da_rivedere → approvato (approve(operator): name and time) →
chiuso (close(): locked, every correction raises RecordingClosedError; reopen() keeps the approval);
saved in the .review.json (stato, approvato_da, approvato_il, chiuso_il; saved_status() reads them
without the data; operator from CARDIAC_FP_OPERATOR or the login). Revisione panel: 'Approvato'
checkbox and 'Chiudi 🔒' / 'Sblocca 🔓' button with the state text; edit buttons, keys and the Edit
menu are off on a closed recording; the state is persisted at once and the queue updated. Queue:
'Stato' column (✓ approved, 🔒 closed, closed rows last in their group). Results export: the state
in the row note and a 'Review state' column of the samples sheet. Manual §5.8.

Co-Authored-By: Claude Fable 5.1 <noreply@anthropic.com>
</commit_message>
<xml_diff>
--- a/docs/MANUALE_Cardiac_FP_Analyzer.docx
+++ b/docs/MANUALE_Cardiac_FP_Analyzer.docx
@@ -7945,6 +7945,173 @@
       </w:r>
       <w:r>
         <w:t xml:space="preserve">; se nel punto scelto non c’è un’onda riconoscibile non si muove nulla e la barra di stato lo dice. Oggi riconosce picchi positivi o negativi a una data latenza, non il ritorno alla linea di base.</w:t>
+      </w:r>
+    </w:p>
+    <w:p>
+      <w:pPr>
+        <w:pStyle w:val="BodyText"/>
+      </w:pPr>
+      <w:r>
+        <w:rPr>
+          <w:b/>
+        </w:rPr>
+        <w:t xml:space="preserve">Approvazione e chiusura</w:t>
+      </w:r>
+      <w:r>
+        <w:t xml:space="preserve"> </w:t>
+      </w:r>
+      <w:r>
+        <w:t xml:space="preserve">(dalla v3.18). Ogni registrazione (ogni ingresso) ha uno stato:</w:t>
+      </w:r>
+      <w:r>
+        <w:t xml:space="preserve"> </w:t>
+      </w:r>
+      <w:r>
+        <w:rPr>
+          <w:i/>
+        </w:rPr>
+        <w:t xml:space="preserve">da rivedere</w:t>
+      </w:r>
+      <w:r>
+        <w:t xml:space="preserve"> </w:t>
+      </w:r>
+      <w:r>
+        <w:t xml:space="preserve">→</w:t>
+      </w:r>
+      <w:r>
+        <w:t xml:space="preserve"> </w:t>
+      </w:r>
+      <w:r>
+        <w:rPr>
+          <w:i/>
+        </w:rPr>
+        <w:t xml:space="preserve">approvato</w:t>
+      </w:r>
+      <w:r>
+        <w:t xml:space="preserve"> </w:t>
+      </w:r>
+      <w:r>
+        <w:t xml:space="preserve">→</w:t>
+      </w:r>
+      <w:r>
+        <w:t xml:space="preserve"> </w:t>
+      </w:r>
+      <w:r>
+        <w:rPr>
+          <w:i/>
+        </w:rPr>
+        <w:t xml:space="preserve">chiuso</w:t>
+      </w:r>
+      <w:r>
+        <w:t xml:space="preserve">. Nel pannello Revisione la spunta</w:t>
+      </w:r>
+      <w:r>
+        <w:t xml:space="preserve"> </w:t>
+      </w:r>
+      <w:r>
+        <w:rPr>
+          <w:b/>
+        </w:rPr>
+        <w:t xml:space="preserve">Approvato</w:t>
+      </w:r>
+      <w:r>
+        <w:t xml:space="preserve"> </w:t>
+      </w:r>
+      <w:r>
+        <w:t xml:space="preserve">segna la registrazione come rivista e approvata, con il nome dell’operatore (il nome di accesso al computer, o la variabile</w:t>
+      </w:r>
+      <w:r>
+        <w:t xml:space="preserve"> </w:t>
+      </w:r>
+      <w:r>
+        <w:rPr>
+          <w:rStyle w:val="VerbatimChar"/>
+        </w:rPr>
+        <w:t xml:space="preserve">CARDIAC_FP_OPERATOR</w:t>
+      </w:r>
+      <w:r>
+        <w:t xml:space="preserve">) e la data;</w:t>
+      </w:r>
+      <w:r>
+        <w:t xml:space="preserve"> </w:t>
+      </w:r>
+      <w:r>
+        <w:rPr>
+          <w:b/>
+        </w:rPr>
+        <w:t xml:space="preserve">Chiudi 🔒</w:t>
+      </w:r>
+      <w:r>
+        <w:t xml:space="preserve"> </w:t>
+      </w:r>
+      <w:r>
+        <w:t xml:space="preserve">la chiude definitivamente: resta approvata e non accetta più correzioni — il menu di Edit, i tasti e i pulsanti sono disattivi — finché non si preme</w:t>
+      </w:r>
+      <w:r>
+        <w:t xml:space="preserve"> </w:t>
+      </w:r>
+      <w:r>
+        <w:rPr>
+          <w:b/>
+        </w:rPr>
+        <w:t xml:space="preserve">Sblocca 🔓</w:t>
+      </w:r>
+      <w:r>
+        <w:t xml:space="preserve">. Spunta e chiusura si salvano subito nel</w:t>
+      </w:r>
+      <w:r>
+        <w:t xml:space="preserve"> </w:t>
+      </w:r>
+      <w:r>
+        <w:rPr>
+          <w:rStyle w:val="VerbatimChar"/>
+        </w:rPr>
+        <w:t xml:space="preserve">.review.json</w:t>
+      </w:r>
+      <w:r>
+        <w:t xml:space="preserve">. Nella coda la colonna</w:t>
+      </w:r>
+      <w:r>
+        <w:t xml:space="preserve"> </w:t>
+      </w:r>
+      <w:r>
+        <w:rPr>
+          <w:i/>
+        </w:rPr>
+        <w:t xml:space="preserve">Stato</w:t>
+      </w:r>
+      <w:r>
+        <w:t xml:space="preserve"> </w:t>
+      </w:r>
+      <w:r>
+        <w:t xml:space="preserve">mostra ✓ per le approvate e 🔒 per le chiuse (in fondo al loro gruppo), così si vede subito che cosa resta da validare; lo stato finisce anche nel foglio Results (nota della riga e colonna</w:t>
+      </w:r>
+      <w:r>
+        <w:t xml:space="preserve"> </w:t>
+      </w:r>
+      <w:r>
+        <w:rPr>
+          <w:i/>
+        </w:rPr>
+        <w:t xml:space="preserve">Review state</w:t>
+      </w:r>
+      <w:r>
+        <w:t xml:space="preserve"> </w:t>
+      </w:r>
+      <w:r>
+        <w:t xml:space="preserve">del foglio</w:t>
+      </w:r>
+      <w:r>
+        <w:t xml:space="preserve"> </w:t>
+      </w:r>
+      <w:r>
+        <w:rPr>
+          <w:rStyle w:val="VerbatimChar"/>
+        </w:rPr>
+        <w:t xml:space="preserve">samples</w:t>
+      </w:r>
+      <w:r>
+        <w:t xml:space="preserve">).</w:t>
       </w:r>
     </w:p>
     <w:p>

</xml_diff>

<commit_message>
feat(nwb): converter window and stand-alone Windows/macOS builds (v3.20.0)
- pyside_app/nwb_converter.py (cardiac-fp-nwb-gui): pick CSV files or a folder,
  fill the optional metadata (gain and time zone have defaults, everything else
  may stay empty), convert on a worker thread; per-file report, fields remembered,
  language from the main application. --self-test converts and reads back a
  synthetic recording.
- nwb_io.convert_many / find_csvs shared by the window and cardiac-fp-nwb.
- packaging/build_nwb_converter.py (PyInstaller; ends with the self-test, which
  caught matplotlib missing in the first build) and workflow build-nwb-converter.yml
  (Windows, macOS arm64 and Intel; manual or tag nwb-converter-v*; release via gh).
- tests/test_nwb_converter.py; Italian catalog entries; manual §3.4, changelogs.

Co-Authored-By: Claude Sonnet 5.5 <noreply@anthropic.com>
</commit_message>
<xml_diff>
--- a/docs/MANUALE_Cardiac_FP_Analyzer.docx
+++ b/docs/MANUALE_Cardiac_FP_Analyzer.docx
@@ -51,7 +51,7 @@
         <w:t xml:space="preserve"> </w:t>
       </w:r>
       <w:r>
-        <w:t xml:space="preserve">3.19.0</w:t>
+        <w:t xml:space="preserve">3.20.0</w:t>
       </w:r>
       <w:r>
         <w:t xml:space="preserve"> </w:t>
@@ -3670,6 +3670,167 @@
     <w:p>
       <w:pPr>
         <w:pStyle w:val="FirstParagraph"/>
+      </w:pPr>
+      <w:r>
+        <w:rPr>
+          <w:b/>
+        </w:rPr>
+        <w:t xml:space="preserve">Convertitore con interfaccia</w:t>
+      </w:r>
+      <w:r>
+        <w:t xml:space="preserve"> </w:t>
+      </w:r>
+      <w:r>
+        <w:t xml:space="preserve">(dalla v3.20). Per chi non usa il terminale c’è una piccola finestra,</w:t>
+      </w:r>
+      <w:r>
+        <w:t xml:space="preserve"> </w:t>
+      </w:r>
+      <w:r>
+        <w:rPr>
+          <w:rStyle w:val="VerbatimChar"/>
+        </w:rPr>
+        <w:t xml:space="preserve">cardiac-fp-nwb-gui</w:t>
+      </w:r>
+      <w:r>
+        <w:t xml:space="preserve">, e un programma autonomo per Windows e macOS (</w:t>
+      </w:r>
+      <w:r>
+        <w:rPr>
+          <w:i/>
+        </w:rPr>
+        <w:t xml:space="preserve">NWB Converter</w:t>
+      </w:r>
+      <w:r>
+        <w:t xml:space="preserve">, non serve installare Python). Si scelgono uno o più CSV oppure una cartella (cercata anche nelle sottocartelle), si compilano i campi noti — guadagno (10000 per il Digilent; 1 se il CSV è già in volt) e fuso orario hanno un valore predefinito, tutti gli altri (laboratorio, istituzione, sperimentatori separati da</w:t>
+      </w:r>
+      <w:r>
+        <w:t xml:space="preserve"> </w:t>
+      </w:r>
+      <w:r>
+        <w:rPr>
+          <w:rStyle w:val="VerbatimChar"/>
+        </w:rPr>
+        <w:t xml:space="preserve">;</w:t>
+      </w:r>
+      <w:r>
+        <w:t xml:space="preserve">, specie, descrizione, note) si possono lasciare vuoti — e si preme</w:t>
+      </w:r>
+      <w:r>
+        <w:t xml:space="preserve"> </w:t>
+      </w:r>
+      <w:r>
+        <w:rPr>
+          <w:i/>
+        </w:rPr>
+        <w:t xml:space="preserve">Converti</w:t>
+      </w:r>
+      <w:r>
+        <w:t xml:space="preserve">. La cartella di destinazione vuota significa</w:t>
+      </w:r>
+      <w:r>
+        <w:t xml:space="preserve"> </w:t>
+      </w:r>
+      <w:r>
+        <w:t xml:space="preserve">“</w:t>
+      </w:r>
+      <w:r>
+        <w:t xml:space="preserve">accanto a ogni CSV</w:t>
+      </w:r>
+      <w:r>
+        <w:t xml:space="preserve">”</w:t>
+      </w:r>
+      <w:r>
+        <w:t xml:space="preserve">; un file che non si converte è segnalato nel registro e gli altri proseguono; i campi sono ricordati per la volta dopo. L’identità di ogni ingresso viene dalla</w:t>
+      </w:r>
+      <w:r>
+        <w:t xml:space="preserve"> </w:t>
+      </w:r>
+      <w:r>
+        <w:rPr>
+          <w:rStyle w:val="VerbatimChar"/>
+        </w:rPr>
+        <w:t xml:space="preserve">samples.csv</w:t>
+      </w:r>
+      <w:r>
+        <w:t xml:space="preserve"> </w:t>
+      </w:r>
+      <w:r>
+        <w:t xml:space="preserve">(anche fino a tre cartelle sopra) o dal nome del file, come nell’analisi. Il programma autonomo non è firmato: su Windows</w:t>
+      </w:r>
+      <w:r>
+        <w:t xml:space="preserve"> </w:t>
+      </w:r>
+      <w:r>
+        <w:rPr>
+          <w:i/>
+        </w:rPr>
+        <w:t xml:space="preserve">Ulteriori informazioni ▸ Esegui comunque</w:t>
+      </w:r>
+      <w:r>
+        <w:t xml:space="preserve">, su Mac clic destro ▸</w:t>
+      </w:r>
+      <w:r>
+        <w:t xml:space="preserve"> </w:t>
+      </w:r>
+      <w:r>
+        <w:rPr>
+          <w:i/>
+        </w:rPr>
+        <w:t xml:space="preserve">Apri</w:t>
+      </w:r>
+      <w:r>
+        <w:t xml:space="preserve"> </w:t>
+      </w:r>
+      <w:r>
+        <w:t xml:space="preserve">la prima volta. I file si scaricano dalla pagina</w:t>
+      </w:r>
+      <w:r>
+        <w:t xml:space="preserve"> </w:t>
+      </w:r>
+      <w:r>
+        <w:rPr>
+          <w:i/>
+        </w:rPr>
+        <w:t xml:space="preserve">Actions ▸ Build NWB converter</w:t>
+      </w:r>
+      <w:r>
+        <w:t xml:space="preserve"> </w:t>
+      </w:r>
+      <w:r>
+        <w:t xml:space="preserve">di GitHub (o dalla release, se il build parte da un tag</w:t>
+      </w:r>
+      <w:r>
+        <w:t xml:space="preserve"> </w:t>
+      </w:r>
+      <w:r>
+        <w:rPr>
+          <w:rStyle w:val="VerbatimChar"/>
+        </w:rPr>
+        <w:t xml:space="preserve">nwb-converter-v…</w:t>
+      </w:r>
+      <w:r>
+        <w:t xml:space="preserve">);</w:t>
+      </w:r>
+      <w:r>
+        <w:t xml:space="preserve"> </w:t>
+      </w:r>
+      <w:r>
+        <w:rPr>
+          <w:rStyle w:val="VerbatimChar"/>
+        </w:rPr>
+        <w:t xml:space="preserve">python packaging/build_nwb_converter.py</w:t>
+      </w:r>
+      <w:r>
+        <w:t xml:space="preserve"> </w:t>
+      </w:r>
+      <w:r>
+        <w:t xml:space="preserve">lo costruisce anche in locale.</w:t>
+      </w:r>
+    </w:p>
+    <w:p>
+      <w:pPr>
+        <w:pStyle w:val="BodyText"/>
       </w:pPr>
       <w:r>
         <w:t xml:space="preserve">Un</w:t>

</xml_diff>

<commit_message>
feat(review): swap depolarisations and repolarisations, align depolarisations to the peak (v3.21.0)
Whole-trace corrections in the Edit menu, on the visible range or the whole recording, undoable:
swap_markers (each repolarisation becomes a beat's depolarisation, the following depolarisation its
repolarisation — for recordings where the software took the repolarisation wave for the spike) and
align_to_peak (markers onto the highest peak within ±25 ms of the displayed trace; the pipeline marks
the steepest point of the spike, the lab's sheets its peak). Manual §5.8, changelogs.

Co-Authored-By: Claude Fable 5.1 <noreply@anthropic.com>
</commit_message>
<xml_diff>
--- a/docs/MANUALE_Cardiac_FP_Analyzer.docx
+++ b/docs/MANUALE_Cardiac_FP_Analyzer.docx
@@ -51,7 +51,7 @@
         <w:t xml:space="preserve"> </w:t>
       </w:r>
       <w:r>
-        <w:t xml:space="preserve">3.20.0</w:t>
+        <w:t xml:space="preserve">3.21.0</w:t>
       </w:r>
       <w:r>
         <w:t xml:space="preserve"> </w:t>
@@ -8196,7 +8196,19 @@
         <w:t xml:space="preserve"> </w:t>
       </w:r>
       <w:r>
-        <w:t xml:space="preserve">(agganciata al picco entro ±10 ms, con la ripolarizzazione proposta); vicino a una croce grigia:</w:t>
+        <w:t xml:space="preserve">(dalla v3.21 agganciata al picco più alto — positivo o negativo — entro ±25 ms</w:t>
+      </w:r>
+      <w:r>
+        <w:t xml:space="preserve"> </w:t>
+      </w:r>
+      <w:r>
+        <w:rPr>
+          <w:b/>
+        </w:rPr>
+        <w:t xml:space="preserve">sul tracciato visualizzato</w:t>
+      </w:r>
+      <w:r>
+        <w:t xml:space="preserve">, quindi sulla vista 1–40 Hz se è quella che si guarda; con la ripolarizzazione proposta); lo stesso vale per</w:t>
       </w:r>
       <w:r>
         <w:t xml:space="preserve"> </w:t>
@@ -8205,6 +8217,18 @@
         <w:rPr>
           <w:i/>
         </w:rPr>
+        <w:t xml:space="preserve">Sposta qui</w:t>
+      </w:r>
+      <w:r>
+        <w:t xml:space="preserve">. L’ampiezza del battito è il picco-picco del segnale non filtrato nei ±10 ms attorno al marcatore, per cui un marcatore fuori dallo spike dava un’ampiezza sbagliata; vicino a una croce grigia:</w:t>
+      </w:r>
+      <w:r>
+        <w:t xml:space="preserve"> </w:t>
+      </w:r>
+      <w:r>
+        <w:rPr>
+          <w:i/>
+        </w:rPr>
         <w:t xml:space="preserve">Ripristina il rilevamento tolto dai veti</w:t>
       </w:r>
       <w:r>
@@ -8235,7 +8259,64 @@
         <w:t xml:space="preserve">… qui e propaga il criterio a tutti</w:t>
       </w:r>
       <w:r>
-        <w:t xml:space="preserve">. I burst di rumore sono evidenziati in grigio. Tastiera: ← → battito precedente/successivo (cerchio arancione), Canc toglie il battito selezionato, P / N ripolarizzazione sul picco positivo / negativo per tutti i battiti, Ctrl+Z / Ctrl+Shift+Z annulla e ripete qualsiasi correzione, Ctrl+S salva.</w:t>
+        <w:t xml:space="preserve">. Nel sottomenu</w:t>
+      </w:r>
+      <w:r>
+        <w:t xml:space="preserve"> </w:t>
+      </w:r>
+      <w:r>
+        <w:rPr>
+          <w:b/>
+        </w:rPr>
+        <w:t xml:space="preserve">Correzioni su tutto il tracciato</w:t>
+      </w:r>
+      <w:r>
+        <w:t xml:space="preserve"> </w:t>
+      </w:r>
+      <w:r>
+        <w:t xml:space="preserve">(dalla v3.21):</w:t>
+      </w:r>
+      <w:r>
+        <w:t xml:space="preserve"> </w:t>
+      </w:r>
+      <w:r>
+        <w:rPr>
+          <w:i/>
+        </w:rPr>
+        <w:t xml:space="preserve">Scambia depolarizzazioni e ripolarizzazioni</w:t>
+      </w:r>
+      <w:r>
+        <w:t xml:space="preserve"> </w:t>
+      </w:r>
+      <w:r>
+        <w:t xml:space="preserve">— nell’intervallo visibile o in tutta la registrazione — per i casi in cui il software ha preso l’onda di ripolarizzazione per lo spike (ogni ripolarizzazione diventa la depolarizzazione di un battito e la depolarizzazione seguente la sua ripolarizzazione; poi si ritocca a mano), e</w:t>
+      </w:r>
+      <w:r>
+        <w:t xml:space="preserve"> </w:t>
+      </w:r>
+      <w:r>
+        <w:rPr>
+          <w:i/>
+        </w:rPr>
+        <w:t xml:space="preserve">Allinea le depolarizzazioni al picco</w:t>
+      </w:r>
+      <w:r>
+        <w:t xml:space="preserve">, che sposta ogni marcatore sul picco più alto entro ±25 ms del tracciato visualizzato (il software marca il punto più ripido dello spike, i fogli del laboratorio il picco). Per lavorare su una parte sola: zoom sull’intervallo (Box o rotella) e poi il comando</w:t>
+      </w:r>
+      <w:r>
+        <w:t xml:space="preserve"> </w:t>
+      </w:r>
+      <w:r>
+        <w:t xml:space="preserve">“</w:t>
+      </w:r>
+      <w:r>
+        <w:t xml:space="preserve">nell’intervallo visibile</w:t>
+      </w:r>
+      <w:r>
+        <w:t xml:space="preserve">”</w:t>
+      </w:r>
+      <w:r>
+        <w:t xml:space="preserve">. Tutto annullabile con Ctrl+Z. I burst di rumore sono evidenziati in grigio. Tastiera: ← → battito precedente/successivo (cerchio arancione), Canc toglie il battito selezionato, P / N ripolarizzazione sul picco positivo / negativo per tutti i battiti, Ctrl+Z / Ctrl+Shift+Z annulla e ripete qualsiasi correzione, Ctrl+S salva.</w:t>
       </w:r>
     </w:p>
     <w:p>

</xml_diff>

<commit_message>
fix(gui): in Edit mode the right button opens the correction menu too (pyqtgraph's menu only in View)
Co-Authored-By: Claude Fable 5.1 <noreply@anthropic.com>
</commit_message>
<xml_diff>
--- a/docs/MANUALE_Cardiac_FP_Analyzer.docx
+++ b/docs/MANUALE_Cardiac_FP_Analyzer.docx
@@ -8154,7 +8154,22 @@
         <w:t xml:space="preserve">Edit</w:t>
       </w:r>
       <w:r>
-        <w:t xml:space="preserve">, clic sul tracciato). Vicino a una depolarizzazione:</w:t>
+        <w:t xml:space="preserve">, clic sul tracciato con il tasto sinistro o destro — in</w:t>
+      </w:r>
+      <w:r>
+        <w:t xml:space="preserve"> </w:t>
+      </w:r>
+      <w:r>
+        <w:rPr>
+          <w:i/>
+        </w:rPr>
+        <w:t xml:space="preserve">Edit</w:t>
+      </w:r>
+      <w:r>
+        <w:t xml:space="preserve"> </w:t>
+      </w:r>
+      <w:r>
+        <w:t xml:space="preserve">il destro non apre più il menu del grafico). Vicino a una depolarizzazione:</w:t>
       </w:r>
       <w:r>
         <w:t xml:space="preserve"> </w:t>

</xml_diff>

<commit_message>
fix(review): depolarisation snap on the filtered trace, local extrema only (v3.21.1)
Snapping on the displayed 1–40 Hz view was wrong: that filter smears the spike and shifts its apparent
peak by 10–20 ms, and in a 25 ms window the slow wave at the edges beat the spike, so the marker (and
the ±10 ms amplitude window) landed off the real spike — align_to_peak scrambled clean recordings.
Now: filtered trace, local extrema only, window edges excluded; on a clean electrode the automatic
markers are already at the peak (0 moved). Manual explains the 1–40 Hz view.

Co-Authored-By: Claude Fable 5.1 <noreply@anthropic.com>
</commit_message>
<xml_diff>
--- a/docs/MANUALE_Cardiac_FP_Analyzer.docx
+++ b/docs/MANUALE_Cardiac_FP_Analyzer.docx
@@ -8220,10 +8220,10 @@
         <w:rPr>
           <w:b/>
         </w:rPr>
-        <w:t xml:space="preserve">sul tracciato visualizzato</w:t>
-      </w:r>
-      <w:r>
-        <w:t xml:space="preserve">, quindi sulla vista 1–40 Hz se è quella che si guarda; con la ripolarizzazione proposta); lo stesso vale per</w:t>
+        <w:t xml:space="preserve">sul tracciato filtrato del software</w:t>
+      </w:r>
+      <w:r>
+        <w:t xml:space="preserve">, con la ripolarizzazione proposta); lo stesso vale per</w:t>
       </w:r>
       <w:r>
         <w:t xml:space="preserve"> </w:t>
@@ -8235,7 +8235,37 @@
         <w:t xml:space="preserve">Sposta qui</w:t>
       </w:r>
       <w:r>
-        <w:t xml:space="preserve">. L’ampiezza del battito è il picco-picco del segnale non filtrato nei ±10 ms attorno al marcatore, per cui un marcatore fuori dallo spike dava un’ampiezza sbagliata; vicino a una croce grigia:</w:t>
+        <w:t xml:space="preserve">. L’ampiezza del battito è il picco-picco del segnale non filtrato nei ±10 ms attorno al marcatore, per cui un marcatore fuori dallo spike dà un’ampiezza sbagliata. Attenzione alla vista</w:t>
+      </w:r>
+      <w:r>
+        <w:t xml:space="preserve"> </w:t>
+      </w:r>
+      <w:r>
+        <w:rPr>
+          <w:b/>
+        </w:rPr>
+        <w:t xml:space="preserve">1–40 Hz</w:t>
+      </w:r>
+      <w:r>
+        <w:t xml:space="preserve">: quel filtro allarga lo spike (pochi ms) e ne sposta il picco apparente di 10–20 ms, quindi un marcatore che sta sullo spike vero può sembrare</w:t>
+      </w:r>
+      <w:r>
+        <w:t xml:space="preserve"> </w:t>
+      </w:r>
+      <w:r>
+        <w:t xml:space="preserve">“</w:t>
+      </w:r>
+      <w:r>
+        <w:t xml:space="preserve">a metà</w:t>
+      </w:r>
+      <w:r>
+        <w:t xml:space="preserve">”</w:t>
+      </w:r>
+      <w:r>
+        <w:t xml:space="preserve"> </w:t>
+      </w:r>
+      <w:r>
+        <w:t xml:space="preserve">della gobba in quella vista; per controllare la posizione dei marcatori di depolarizzazione si usa la vista</w:t>
       </w:r>
       <w:r>
         <w:t xml:space="preserve"> </w:t>
@@ -8244,6 +8274,33 @@
         <w:rPr>
           <w:i/>
         </w:rPr>
+        <w:t xml:space="preserve">Filtrato</w:t>
+      </w:r>
+      <w:r>
+        <w:t xml:space="preserve"> </w:t>
+      </w:r>
+      <w:r>
+        <w:t xml:space="preserve">(o</w:t>
+      </w:r>
+      <w:r>
+        <w:t xml:space="preserve"> </w:t>
+      </w:r>
+      <w:r>
+        <w:rPr>
+          <w:i/>
+        </w:rPr>
+        <w:t xml:space="preserve">Grezzo</w:t>
+      </w:r>
+      <w:r>
+        <w:t xml:space="preserve">), la 1–40 Hz serve per le ripolarizzazioni; vicino a una croce grigia:</w:t>
+      </w:r>
+      <w:r>
+        <w:t xml:space="preserve"> </w:t>
+      </w:r>
+      <w:r>
+        <w:rPr>
+          <w:i/>
+        </w:rPr>
         <w:t xml:space="preserve">Ripristina il rilevamento tolto dai veti</w:t>
       </w:r>
       <w:r>
@@ -8316,7 +8373,7 @@
         <w:t xml:space="preserve">Allinea le depolarizzazioni al picco</w:t>
       </w:r>
       <w:r>
-        <w:t xml:space="preserve">, che sposta ogni marcatore sul picco più alto entro ±25 ms del tracciato visualizzato (il software marca il punto più ripido dello spike, i fogli del laboratorio il picco). Per lavorare su una parte sola: zoom sull’intervallo (Box o rotella) e poi il comando</w:t>
+        <w:t xml:space="preserve">, che sposta ogni marcatore sul picco più alto entro ±25 ms del tracciato filtrato (sulle registrazioni pulite i marcatori automatici sono già lì e il comando non sposta nulla; serve dopo correzioni a mano o su segnali deboli, dove va usato con giudizio). Per lavorare su una parte sola: zoom sull’intervallo (Box o rotella) e poi il comando</w:t>
       </w:r>
       <w:r>
         <w:t xml:space="preserve"> </w:t>

</xml_diff>

<commit_message>
review: approving or closing applies pending edits first (no stale measures frozen)
Co-Authored-By: Claude Sonnet 5.5 <noreply@anthropic.com>
</commit_message>
<xml_diff>
--- a/docs/MANUALE_Cardiac_FP_Analyzer.docx
+++ b/docs/MANUALE_Cardiac_FP_Analyzer.docx
@@ -9321,7 +9321,22 @@
         <w:t xml:space="preserve">Sblocca 🔓</w:t>
       </w:r>
       <w:r>
-        <w:t xml:space="preserve">. Spunta e chiusura si salvano subito nel</w:t>
+        <w:t xml:space="preserve">. Se ci sono correzioni non ancora applicate (il pulsante</w:t>
+      </w:r>
+      <w:r>
+        <w:t xml:space="preserve"> </w:t>
+      </w:r>
+      <w:r>
+        <w:rPr>
+          <w:i/>
+        </w:rPr>
+        <w:t xml:space="preserve">Ricalcola</w:t>
+      </w:r>
+      <w:r>
+        <w:t xml:space="preserve"> </w:t>
+      </w:r>
+      <w:r>
+        <w:t xml:space="preserve">è arancione), approvare o chiudere ricalcola prima le misure, così non si approva mai un risultato non aggiornato. Spunta e chiusura si salvano subito nel</w:t>
       </w:r>
       <w:r>
         <w:t xml:space="preserve"> </w:t>

</xml_diff>

<commit_message>
review: snap/align keep the spike side of the recording (window-independent), align looks ±40 ms and settles
A window-local median let a slow wave after the spike flip the snap to a baseline dip, and a second
'align' undid the first.

Co-Authored-By: Claude Sonnet 5.5 <noreply@anthropic.com>
</commit_message>
<xml_diff>
--- a/docs/MANUALE_Cardiac_FP_Analyzer.docx
+++ b/docs/MANUALE_Cardiac_FP_Analyzer.docx
@@ -8821,7 +8821,7 @@
         <w:t xml:space="preserve"> </w:t>
       </w:r>
       <w:r>
-        <w:t xml:space="preserve">(dalla v3.21 agganciata al picco più alto — positivo o negativo — entro ±25 ms</w:t>
+        <w:t xml:space="preserve">(dalla v3.21 agganciata al picco entro ±25 ms</w:t>
       </w:r>
       <w:r>
         <w:t xml:space="preserve"> </w:t>
@@ -8833,7 +8833,7 @@
         <w:t xml:space="preserve">sul tracciato filtrato del software</w:t>
       </w:r>
       <w:r>
-        <w:t xml:space="preserve">, con la ripolarizzazione proposta); lo stesso vale per</w:t>
+        <w:t xml:space="preserve">, dal lato degli spike della registrazione (positivo o negativo), con la ripolarizzazione proposta); lo stesso vale per</w:t>
       </w:r>
       <w:r>
         <w:t xml:space="preserve"> </w:t>
@@ -8983,7 +8983,7 @@
         <w:t xml:space="preserve">Allinea le depolarizzazioni al picco</w:t>
       </w:r>
       <w:r>
-        <w:t xml:space="preserve">, che sposta ogni marcatore sul picco più alto entro ±25 ms del tracciato filtrato (sulle registrazioni pulite i marcatori automatici sono già lì e il comando non sposta nulla; serve dopo correzioni a mano o su segnali deboli, dove va usato con giudizio). Per lavorare su una parte sola: zoom sull’intervallo (Box o rotella) e poi il comando</w:t>
+        <w:t xml:space="preserve">, che sposta ogni marcatore sul picco entro ±40 ms del tracciato filtrato, dal lato su cui stanno gli spike della registrazione (positivo o negativo, deciso sull’insieme dei battiti: un’onda lenta accanto allo spike non lo fa più scambiare con una oscillazione di base), e ripete finché il marcatore non si muove più (sulle registrazioni pulite i marcatori automatici sono già lì e il comando non sposta nulla; serve dopo correzioni a mano o su segnali deboli, dove va usato con giudizio). Per lavorare su una parte sola: zoom sull’intervallo (Box o rotella) e poi il comando</w:t>
       </w:r>
       <w:r>
         <w:t xml:space="preserve"> </w:t>

</xml_diff>

<commit_message>
amplitude and time read on the unfiltered signal: summary spike_amplitude_mV_* from raw (filtered kept as *_filtered_*), snapped markers refined on the raw peak
Co-Authored-By: Claude Sonnet 5.5 <noreply@anthropic.com>
</commit_message>
<xml_diff>
--- a/docs/MANUALE_Cardiac_FP_Analyzer.docx
+++ b/docs/MANUALE_Cardiac_FP_Analyzer.docx
@@ -8999,6 +8999,59 @@
       </w:r>
       <w:r>
         <w:t xml:space="preserve">. Tutto annullabile con Ctrl+Z. I burst di rumore sono evidenziati in grigio. Tastiera: ← → battito precedente/successivo (cerchio arancione), Canc toglie il battito selezionato, P / N ripolarizzazione sul picco positivo / negativo per tutti i battiti, Ctrl+Z / Ctrl+Shift+Z annulla e ripete qualsiasi correzione, Ctrl+S salva.</w:t>
+      </w:r>
+    </w:p>
+    <w:p>
+      <w:pPr>
+        <w:pStyle w:val="BodyText"/>
+      </w:pPr>
+      <w:r>
+        <w:rPr>
+          <w:b/>
+        </w:rPr>
+        <w:t xml:space="preserve">Ampiezza e tempo sul segnale non filtrato.</w:t>
+      </w:r>
+      <w:r>
+        <w:t xml:space="preserve"> </w:t>
+      </w:r>
+      <w:r>
+        <w:t xml:space="preserve">Il picco si individua sul tracciato filtrato (pulito), ma il tempo corretto della depolarizzazione e l’ampiezza si leggono sul segnale grezzo, come fanno gli operatori: i marcatori agganciati dal software (clic,</w:t>
+      </w:r>
+      <w:r>
+        <w:t xml:space="preserve"> </w:t>
+      </w:r>
+      <w:r>
+        <w:rPr>
+          <w:i/>
+        </w:rPr>
+        <w:t xml:space="preserve">Allinea</w:t>
+      </w:r>
+      <w:r>
+        <w:t xml:space="preserve">) si portano sul picco grezzo entro ±8 ms, e l’ampiezza è il picco-picco grezzo da 30 ms prima a 30 ms dopo il marcatore, sia nel pannello Revisione sia nelle statistiche del batch (</w:t>
+      </w:r>
+      <w:r>
+        <w:rPr>
+          <w:rStyle w:val="VerbatimChar"/>
+        </w:rPr>
+        <w:t xml:space="preserve">spike_amplitude_mV_*</w:t>
+      </w:r>
+      <w:r>
+        <w:t xml:space="preserve">; il valore sul segnale filtrato resta in</w:t>
+      </w:r>
+      <w:r>
+        <w:t xml:space="preserve"> </w:t>
+      </w:r>
+      <w:r>
+        <w:rPr>
+          <w:rStyle w:val="VerbatimChar"/>
+        </w:rPr>
+        <w:t xml:space="preserve">spike_amplitude_filtered_mV_*</w:t>
+      </w:r>
+      <w:r>
+        <w:t xml:space="preserve"> </w:t>
+      </w:r>
+      <w:r>
+        <w:t xml:space="preserve">e continua a servire al controllo di qualità e ai segnali di allarme). Sul corpus di sviluppo (145 registrazioni) l’errore mediano rispetto all’operatore scende dal 31 % al 5 %.</w:t>
       </w:r>
     </w:p>
     <w:p>

</xml_diff>

<commit_message>
review: drag a marker in Edit mode (dep snaps to the spike, repol to the nearest extremum, Shift = exact)
Cate's feedback: placing markers by click menu was not precise enough. A left-button drag that starts on a
marker moves it (preview of the landing point while dragging, undoable, refused when closed); any other
drag pans/zooms as before. A depolarisation cannot be dropped on another one. Hover hint in Edit mode.

Co-Authored-By: Claude Opus 5.5 <noreply@anthropic.com>
</commit_message>
<xml_diff>
--- a/docs/MANUALE_Cardiac_FP_Analyzer.docx
+++ b/docs/MANUALE_Cardiac_FP_Analyzer.docx
@@ -8998,7 +8998,49 @@
         <w:t xml:space="preserve">”</w:t>
       </w:r>
       <w:r>
-        <w:t xml:space="preserve">. Tutto annullabile con Ctrl+Z. I burst di rumore sono evidenziati in grigio. Tastiera: ← → battito precedente/successivo (cerchio arancione), Canc toglie il battito selezionato, P / N ripolarizzazione sul picco positivo / negativo per tutti i battiti, Ctrl+Z / Ctrl+Shift+Z annulla e ripete qualsiasi correzione, Ctrl+S salva.</w:t>
+        <w:t xml:space="preserve">.</w:t>
+      </w:r>
+      <w:r>
+        <w:t xml:space="preserve"> </w:t>
+      </w:r>
+      <w:r>
+        <w:rPr>
+          <w:b/>
+        </w:rPr>
+        <w:t xml:space="preserve">Trascinare i marcatori</w:t>
+      </w:r>
+      <w:r>
+        <w:t xml:space="preserve"> </w:t>
+      </w:r>
+      <w:r>
+        <w:t xml:space="preserve">(dalla v3.23). In</w:t>
+      </w:r>
+      <w:r>
+        <w:t xml:space="preserve"> </w:t>
+      </w:r>
+      <w:r>
+        <w:rPr>
+          <w:i/>
+        </w:rPr>
+        <w:t xml:space="preserve">Edit</w:t>
+      </w:r>
+      <w:r>
+        <w:t xml:space="preserve"> </w:t>
+      </w:r>
+      <w:r>
+        <w:t xml:space="preserve">un marcatore si può anche trascinare con il tasto sinistro: si preme sul triangolo (rosso per la depolarizzazione, verde per la ripolarizzazione), si sposta e si rilascia. Durante il trascinamento un triangolo semitrasparente mostra dove il marcatore andrà: la depolarizzazione si aggancia al picco dello spike (come</w:t>
+      </w:r>
+      <w:r>
+        <w:t xml:space="preserve"> </w:t>
+      </w:r>
+      <w:r>
+        <w:rPr>
+          <w:i/>
+        </w:rPr>
+        <w:t xml:space="preserve">Sposta qui</w:t>
+      </w:r>
+      <w:r>
+        <w:t xml:space="preserve">, poi riletto sul segnale non filtrato), la ripolarizzazione all’estremo più vicino del tracciato visualizzato. Tenendo premuto Shift al rilascio il marcatore resta esattamente dove lo si lascia, senza aggancio. Una depolarizzazione non si può lasciare su un’altra; un trascinamento che non parte da un marcatore sposta o ingrandisce la vista come sempre; su una registrazione chiusa il trascinamento è rifiutato. Passando con il mouse su un marcatore la barra di stato lo ricorda. Tutto annullabile con Ctrl+Z. I burst di rumore sono evidenziati in grigio. Tastiera: ← → battito precedente/successivo (cerchio arancione), Canc toglie il battito selezionato, P / N ripolarizzazione sul picco positivo / negativo per tutti i battiti, Ctrl+Z / Ctrl+Shift+Z annulla e ripete qualsiasi correzione, Ctrl+S salva.</w:t>
       </w:r>
     </w:p>
     <w:p>

</xml_diff>

<commit_message>
review panel: the whole quality judgement unfolds with a link (and folds back)
Cate's feedback: the list stopped at three problems and hovering did not open it. Rich-text list with a
'show all (N more)' / 'show less' link, text escaped, tooltip kept.

Co-Authored-By: Claude Opus 5.5 <noreply@anthropic.com>
</commit_message>
<xml_diff>
--- a/docs/MANUALE_Cardiac_FP_Analyzer.docx
+++ b/docs/MANUALE_Cardiac_FP_Analyzer.docx
@@ -8546,7 +8546,34 @@
         <w:t xml:space="preserve"> </w:t>
       </w:r>
       <w:r>
-        <w:t xml:space="preserve">— con l’elenco dei problemi trovati (non analizzabile e perché, segnale debole, burst di rumore dell’incubatore e quanto tempo occupano, battiti mancanti, ritmo irregolare o con buchi, FPD non misurabile o incerto, rilevamenti tolti dai veti, ingresso senza tessuto, stato della camera). Poi la</w:t>
+        <w:t xml:space="preserve">— con l’elenco dei problemi trovati (non analizzabile e perché, segnale debole, burst di rumore dell’incubatore e quanto tempo occupano, battiti mancanti, ritmo irregolare o con buchi, FPD non misurabile o incerto, rilevamenti tolti dai veti, ingresso senza tessuto, stato della camera). Se i problemi sono più di tre se ne vedono i primi tre e il collegamento</w:t>
+      </w:r>
+      <w:r>
+        <w:t xml:space="preserve"> </w:t>
+      </w:r>
+      <w:r>
+        <w:rPr>
+          <w:i/>
+        </w:rPr>
+        <w:t xml:space="preserve">… mostra tutto (altri N)</w:t>
+      </w:r>
+      <w:r>
+        <w:t xml:space="preserve"> </w:t>
+      </w:r>
+      <w:r>
+        <w:t xml:space="preserve">apre l’elenco completo (</w:t>
+      </w:r>
+      <w:r>
+        <w:rPr>
+          <w:i/>
+        </w:rPr>
+        <w:t xml:space="preserve">mostra meno</w:t>
+      </w:r>
+      <w:r>
+        <w:t xml:space="preserve"> </w:t>
+      </w:r>
+      <w:r>
+        <w:t xml:space="preserve">lo richiude; la scelta resta per le registrazioni successive); l’elenco completo è anche nel suggerimento che compare passando con il mouse. Poi la</w:t>
       </w:r>
       <w:r>
         <w:t xml:space="preserve"> </w:t>

</xml_diff>

<commit_message>
repolarisation: one polarity per recording (per_beat_polarity='majority', 2/3)
Operators' feedback: on a biphasic wave some beats took the positive lobe, others the negative one. A free
pass, then every beat searched with the recording's sign first (the template's, unless two thirds of the
beats chose the other). GG vs operator: mixed-polarity recordings 71 -> 9 (DEV), 28 -> 4 (TEST);
repolarisations within 20 ms 57.3 -> 61.8 % (DEV), 63.5 -> 68.4 % (TEST); recording FPD within 5 %
55.2 -> 55.2 % (DEV), 62.5 -> 65.6 % (TEST); official DEV scorecard FPD±10 % 67 -> 66 % (3 electrodes
cross the line, 2 grade A near 10 %). 'free' and 'template' kept as options; repol_sign per beat.

Co-Authored-By: Claude Opus 5.5 <noreply@anthropic.com>
</commit_message>
<xml_diff>
--- a/docs/MANUALE_Cardiac_FP_Analyzer.docx
+++ b/docs/MANUALE_Cardiac_FP_Analyzer.docx
@@ -12037,7 +12037,19 @@
         <w:t xml:space="preserve">per battito</w:t>
       </w:r>
       <w:r>
-        <w:t xml:space="preserve">, attorno alla posizione trovata sul template (± 150 ms), con soglia 1,5 × rumore; i battiti senza onda hanno FPD NaN.</w:t>
+        <w:t xml:space="preserve">, attorno alla posizione trovata sul template (± 150 ms), con soglia 1,5 × rumore; i battiti senza onda hanno FPD NaN. Dalla v3.23 l’onda ha la</w:t>
+      </w:r>
+      <w:r>
+        <w:t xml:space="preserve"> </w:t>
+      </w:r>
+      <w:r>
+        <w:rPr>
+          <w:b/>
+        </w:rPr>
+        <w:t xml:space="preserve">stessa polarità in tutta la registrazione</w:t>
+      </w:r>
+      <w:r>
+        <w:t xml:space="preserve">: con un’onda bifasica alcuni battiti prendevano il lobo positivo e altri quello negativo (segnalato dagli operatori). Ora ogni battito cerca prima il segno della registrazione — quello del template, oppure l’altro se almeno due battiti su tre lo hanno scelto — e il lobo opposto solo se di quel segno non c’è un’onda sopra la soglia. Sul corpus GG le registrazioni con polarità mista passano da 71 a 9 (sviluppo) e da 28 a 4 (test), le ripolarizzazioni entro 20 ms da quelle dell’operatore dal 57 al 62 % e dal 64 al 68 %; il confronto per registrazione resta invariato (un elettrodo in meno entro ±10 % sullo sviluppo, tre in più entro ±5 % sul test); circa il 5 % dei battiti resta senza ripolarizzazione invece di prendere l’altro lobo.</w:t>
       </w:r>
       <w:r>
         <w:t xml:space="preserve"> </w:t>

</xml_diff>

<commit_message>
review: spike side fixed per recording and read on the raw signal; Shift+P/Shift+N (Dep +/-) to impose it
Operators: on the raw view a dropped triangle and 'align' went to a positive bump next to a narrow negative
spike. The side was voted on the filtered trace (where smoothing shrinks a narrow spike) over the current
markers (so edits could flip it). Now decided once on the software's detections, on the unfiltered signal,
median per-beat difference; the operator can impose it (set_dep_polarity, Shift+P / Shift+N, Dep +/-
buttons; repolarisation buttons renamed Repol +/-), one undoable step, saved as polarita_dep.
Docs: manual (Alt+arrows paragraph lost in the previous commit), quick guide; Visone regression of the
v3.23 polarity policy in the changelog (drug calls 8/12 -> 8/12, authors' values unchanged).

Co-Authored-By: Claude Opus 5.5 <noreply@anthropic.com>
</commit_message>
<xml_diff>
--- a/docs/MANUALE_Cardiac_FP_Analyzer.docx
+++ b/docs/MANUALE_Cardiac_FP_Analyzer.docx
@@ -9067,7 +9067,145 @@
         <w:t xml:space="preserve">Sposta qui</w:t>
       </w:r>
       <w:r>
-        <w:t xml:space="preserve">, poi riletto sul segnale non filtrato), la ripolarizzazione all’estremo più vicino del tracciato visualizzato. Tenendo premuto Shift al rilascio il marcatore resta esattamente dove lo si lascia, senza aggancio. Una depolarizzazione non si può lasciare su un’altra; un trascinamento che non parte da un marcatore sposta o ingrandisce la vista come sempre; su una registrazione chiusa il trascinamento è rifiutato. Passando con il mouse su un marcatore la barra di stato lo ricorda. Tutto annullabile con Ctrl+Z. I burst di rumore sono evidenziati in grigio. Tastiera: ← → battito precedente/successivo (cerchio arancione), Canc toglie il battito selezionato, P / N ripolarizzazione sul picco positivo / negativo per tutti i battiti, Ctrl+Z / Ctrl+Shift+Z annulla e ripete qualsiasi correzione, Ctrl+S salva.</w:t>
+        <w:t xml:space="preserve">, poi riletto sul segnale non filtrato), la ripolarizzazione all’estremo più vicino del tracciato visualizzato. Tenendo premuto Shift al rilascio il marcatore resta esattamente dove lo si lascia, senza aggancio. Una depolarizzazione non si può lasciare su un’altra; un trascinamento che non parte da un marcatore sposta o ingrandisce la vista come sempre; su una registrazione chiusa il trascinamento è rifiutato. Passando con il mouse su un marcatore la barra di stato lo ricorda. Il mouse si muove a passi di un pixel: con tutta la registrazione a schermo un pixel copre decine di millisecondi, quindi per un posizionamento fine si ingrandisce (Box o rotella) oppure si usano i tasti</w:t>
+      </w:r>
+      <w:r>
+        <w:t xml:space="preserve"> </w:t>
+      </w:r>
+      <w:r>
+        <w:rPr>
+          <w:b/>
+        </w:rPr>
+        <w:t xml:space="preserve">Alt+← / Alt+→</w:t>
+      </w:r>
+      <w:r>
+        <w:t xml:space="preserve">, che spostano di un campione la depolarizzazione del battito selezionato (cerchio arancione; dopo un trascinamento è quello trascinato), e</w:t>
+      </w:r>
+      <w:r>
+        <w:t xml:space="preserve"> </w:t>
+      </w:r>
+      <w:r>
+        <w:rPr>
+          <w:b/>
+        </w:rPr>
+        <w:t xml:space="preserve">Alt+Shift+← / →</w:t>
+      </w:r>
+      <w:r>
+        <w:t xml:space="preserve"> </w:t>
+      </w:r>
+      <w:r>
+        <w:t xml:space="preserve">per la sua ripolarizzazione. Il</w:t>
+      </w:r>
+      <w:r>
+        <w:t xml:space="preserve"> </w:t>
+      </w:r>
+      <w:r>
+        <w:rPr>
+          <w:b/>
+        </w:rPr>
+        <w:t xml:space="preserve">lato dello spike</w:t>
+      </w:r>
+      <w:r>
+        <w:t xml:space="preserve"> </w:t>
+      </w:r>
+      <w:r>
+        <w:t xml:space="preserve">(picco positivo o negativo) su cui si agganciano e si allineano le depolarizzazioni è deciso all’apertura sui rilevamenti del software, guardando il segnale non filtrato, e non cambia con le correzioni; se non è quello giusto (spike bifasici) si impone con</w:t>
+      </w:r>
+      <w:r>
+        <w:t xml:space="preserve"> </w:t>
+      </w:r>
+      <w:r>
+        <w:rPr>
+          <w:b/>
+        </w:rPr>
+        <w:t xml:space="preserve">Shift+P / Shift+N</w:t>
+      </w:r>
+      <w:r>
+        <w:t xml:space="preserve"> </w:t>
+      </w:r>
+      <w:r>
+        <w:t xml:space="preserve">o con i pulsanti</w:t>
+      </w:r>
+      <w:r>
+        <w:t xml:space="preserve"> </w:t>
+      </w:r>
+      <w:r>
+        <w:rPr>
+          <w:i/>
+        </w:rPr>
+        <w:t xml:space="preserve">Dep +</w:t>
+      </w:r>
+      <w:r>
+        <w:t xml:space="preserve"> </w:t>
+      </w:r>
+      <w:r>
+        <w:t xml:space="preserve">/</w:t>
+      </w:r>
+      <w:r>
+        <w:t xml:space="preserve"> </w:t>
+      </w:r>
+      <w:r>
+        <w:rPr>
+          <w:i/>
+        </w:rPr>
+        <w:t xml:space="preserve">Dep −</w:t>
+      </w:r>
+      <w:r>
+        <w:t xml:space="preserve">, che spostano tutte le depolarizzazioni sul picco di quel lato; la scelta resta per la registrazione e si salva. Il triangolo rosso è disegnato sulla cresta del tracciato visualizzato entro ±2 ms dal suo tempo (il tempo è quello del picco sul segnale non filtrato, che può distare un campione o due dalla cresta del filtrato). Tutto annullabile con Ctrl+Z. I burst di rumore sono evidenziati in grigio. Tastiera: ← → battito precedente/successivo (cerchio arancione), Canc toglie il battito selezionato, P / N ripolarizzazione sul picco positivo / negativo per tutti i battiti (pulsanti</w:t>
+      </w:r>
+      <w:r>
+        <w:t xml:space="preserve"> </w:t>
+      </w:r>
+      <w:r>
+        <w:rPr>
+          <w:i/>
+        </w:rPr>
+        <w:t xml:space="preserve">Ripol +</w:t>
+      </w:r>
+      <w:r>
+        <w:t xml:space="preserve"> </w:t>
+      </w:r>
+      <w:r>
+        <w:t xml:space="preserve">/</w:t>
+      </w:r>
+      <w:r>
+        <w:t xml:space="preserve"> </w:t>
+      </w:r>
+      <w:r>
+        <w:rPr>
+          <w:i/>
+        </w:rPr>
+        <w:t xml:space="preserve">Ripol −</w:t>
+      </w:r>
+      <w:r>
+        <w:t xml:space="preserve">), Shift+P / Shift+N depolarizzazioni sul picco positivo / negativo (pulsanti</w:t>
+      </w:r>
+      <w:r>
+        <w:t xml:space="preserve"> </w:t>
+      </w:r>
+      <w:r>
+        <w:rPr>
+          <w:i/>
+        </w:rPr>
+        <w:t xml:space="preserve">Dep +</w:t>
+      </w:r>
+      <w:r>
+        <w:t xml:space="preserve"> </w:t>
+      </w:r>
+      <w:r>
+        <w:t xml:space="preserve">/</w:t>
+      </w:r>
+      <w:r>
+        <w:t xml:space="preserve"> </w:t>
+      </w:r>
+      <w:r>
+        <w:rPr>
+          <w:i/>
+        </w:rPr>
+        <w:t xml:space="preserve">Dep −</w:t>
+      </w:r>
+      <w:r>
+        <w:t xml:space="preserve">), Alt+← / → e Alt+Shift+← / → un campione per la depolarizzazione / ripolarizzazione selezionata, Ctrl+Z / Ctrl+Shift+Z annulla e ripete qualsiasi correzione, Ctrl+S salva.</w:t>
       </w:r>
     </w:p>
     <w:p>

</xml_diff>